<commit_message>
update hyperlink to zenodo
</commit_message>
<xml_diff>
--- a/baltic/drafts/GCB/accepted/MS-warming-size-spectrum-model.docx
+++ b/baltic/drafts/GCB/accepted/MS-warming-size-spectrum-model.docx
@@ -67,15 +67,7 @@
           <w:rFonts w:ascii="Times" w:hAnsi="Times" w:cstheme="minorHAnsi"/>
           <w:lang w:val="sv-SE"/>
         </w:rPr>
-        <w:t xml:space="preserve">, Asta </w:t>
-      </w:r>
-      <w:proofErr w:type="spellStart"/>
-      <w:r>
-        <w:rPr>
-          <w:rFonts w:ascii="Times" w:hAnsi="Times" w:cstheme="minorHAnsi"/>
-          <w:lang w:val="sv-SE"/>
-        </w:rPr>
-        <w:t>Audzijonyte</w:t>
+        <w:t>, Asta Audzijonyte</w:t>
       </w:r>
       <w:r>
         <w:rPr>
@@ -85,21 +77,12 @@
         </w:rPr>
         <w:t>b</w:t>
       </w:r>
-      <w:proofErr w:type="spellEnd"/>
       <w:r>
         <w:rPr>
           <w:rFonts w:ascii="Times" w:hAnsi="Times" w:cstheme="minorHAnsi"/>
           <w:lang w:val="sv-SE"/>
         </w:rPr>
-        <w:t xml:space="preserve">, Julia </w:t>
-      </w:r>
-      <w:proofErr w:type="spellStart"/>
-      <w:r>
-        <w:rPr>
-          <w:rFonts w:ascii="Times" w:hAnsi="Times" w:cstheme="minorHAnsi"/>
-          <w:lang w:val="sv-SE"/>
-        </w:rPr>
-        <w:t>Blanchard</w:t>
+        <w:t>, Julia Blanchard</w:t>
       </w:r>
       <w:r>
         <w:rPr>
@@ -109,21 +92,12 @@
         </w:rPr>
         <w:t>c</w:t>
       </w:r>
-      <w:proofErr w:type="spellEnd"/>
       <w:r>
         <w:rPr>
           <w:rFonts w:ascii="Times" w:hAnsi="Times" w:cstheme="minorHAnsi"/>
           <w:lang w:val="sv-SE"/>
         </w:rPr>
-        <w:t xml:space="preserve">, Anna </w:t>
-      </w:r>
-      <w:proofErr w:type="spellStart"/>
-      <w:r>
-        <w:rPr>
-          <w:rFonts w:ascii="Times" w:hAnsi="Times" w:cstheme="minorHAnsi"/>
-          <w:lang w:val="sv-SE"/>
-        </w:rPr>
-        <w:t>Gårdmark</w:t>
+        <w:t>, Anna Gårdmark</w:t>
       </w:r>
       <w:r>
         <w:rPr>
@@ -133,7 +107,6 @@
         </w:rPr>
         <w:t>d</w:t>
       </w:r>
-      <w:proofErr w:type="spellEnd"/>
     </w:p>
     <w:p>
       <w:pPr>
@@ -16275,7 +16248,6 @@
         <w:lastRenderedPageBreak/>
         <w:t>Activation energies are estimated with uncertainty a</w:t>
       </w:r>
-      <w:proofErr w:type="spellStart"/>
       <w:r>
         <w:rPr>
           <w:color w:val="000000"/>
@@ -16283,7 +16255,6 @@
         </w:rPr>
         <w:t>nd</w:t>
       </w:r>
-      <w:proofErr w:type="spellEnd"/>
       <w:r>
         <w:rPr>
           <w:color w:val="000000"/>
@@ -20576,23 +20547,13 @@
         </w:rPr>
         <w:t>. Temperature-dependen</w:t>
       </w:r>
-      <w:proofErr w:type="spellStart"/>
       <w:r>
         <w:rPr>
           <w:rFonts w:cstheme="minorHAnsi"/>
           <w:bCs/>
           <w:lang w:val="en-US"/>
         </w:rPr>
-        <w:t>ce</w:t>
-      </w:r>
-      <w:proofErr w:type="spellEnd"/>
-      <w:r>
-        <w:rPr>
-          <w:rFonts w:cstheme="minorHAnsi"/>
-          <w:bCs/>
-          <w:lang w:val="en-US"/>
-        </w:rPr>
-        <w:t xml:space="preserve"> of</w:t>
+        <w:t>ce of</w:t>
       </w:r>
       <w:r>
         <w:rPr>
@@ -21571,7 +21532,6 @@
         </w:rPr>
         <w:t>hanges in the size-structure var</w:t>
       </w:r>
-      <w:proofErr w:type="spellStart"/>
       <w:r>
         <w:rPr>
           <w:rFonts w:cstheme="minorHAnsi"/>
@@ -21580,7 +21540,6 @@
         </w:rPr>
         <w:t>ied</w:t>
       </w:r>
-      <w:proofErr w:type="spellEnd"/>
       <w:r>
         <w:rPr>
           <w:rFonts w:cstheme="minorHAnsi"/>
@@ -27722,7 +27681,6 @@
         <w:contextualSpacing/>
         <w:jc w:val="both"/>
         <w:rPr>
-          <w:del w:id="0" w:author="Max Lindmark" w:date="2022-07-12T14:48:00Z"/>
           <w:rFonts w:cstheme="minorHAnsi"/>
         </w:rPr>
       </w:pPr>
@@ -27732,165 +27690,132 @@
         </w:rPr>
         <w:t>All model code (parameterization, calibration and analysis) and data are available on GitHub (</w:t>
       </w:r>
-      <w:r>
-        <w:fldChar w:fldCharType="begin"/>
-      </w:r>
-      <w:r>
-        <w:instrText xml:space="preserve"> HYPERLINK "https://github.com/maxlindmark/mizer-rewiring/tree/rewire-temp/baltic" </w:instrText>
-      </w:r>
-      <w:r>
-        <w:fldChar w:fldCharType="separate"/>
-      </w:r>
-      <w:r>
-        <w:rPr>
-          <w:rStyle w:val="Hyperlink"/>
-          <w:rFonts w:cstheme="minorHAnsi"/>
-        </w:rPr>
-        <w:t>https://github.com/maxlindmark/mizer-rewiring/tree/rewire-temp/baltic</w:t>
-      </w:r>
-      <w:r>
-        <w:rPr>
-          <w:rStyle w:val="Hyperlink"/>
-          <w:rFonts w:cstheme="minorHAnsi"/>
-        </w:rPr>
-        <w:fldChar w:fldCharType="end"/>
-      </w:r>
-      <w:r>
-        <w:rPr>
-          <w:rFonts w:cstheme="minorHAnsi"/>
-        </w:rPr>
-        <w:t xml:space="preserve">) and </w:t>
-      </w:r>
-      <w:r>
-        <w:rPr>
-          <w:rFonts w:cstheme="minorHAnsi"/>
-          <w:lang w:val="en-US"/>
-        </w:rPr>
-        <w:t>have</w:t>
-      </w:r>
-      <w:r>
-        <w:rPr>
-          <w:rFonts w:cstheme="minorHAnsi"/>
-        </w:rPr>
-        <w:t xml:space="preserve"> be</w:t>
-      </w:r>
-      <w:proofErr w:type="spellStart"/>
-      <w:r>
-        <w:rPr>
-          <w:rFonts w:cstheme="minorHAnsi"/>
-          <w:lang w:val="en-US"/>
-        </w:rPr>
-        <w:t>en</w:t>
-      </w:r>
-      <w:proofErr w:type="spellEnd"/>
-      <w:r>
-        <w:rPr>
-          <w:rFonts w:cstheme="minorHAnsi"/>
-        </w:rPr>
-        <w:t xml:space="preserve"> deposited on </w:t>
-      </w:r>
-      <w:del w:id="1" w:author="Max Lindmark" w:date="2022-07-12T14:48:00Z">
+      <w:hyperlink r:id="rId8" w:history="1">
         <w:r>
           <w:rPr>
+            <w:rStyle w:val="Hyperlink"/>
             <w:rFonts w:cstheme="minorHAnsi"/>
           </w:rPr>
-          <w:delText>Zenodo</w:delText>
+          <w:t>https://github.com/maxlindmark/mizer-rewiring/tree/rewire-temp/baltic</w:t>
         </w:r>
+      </w:hyperlink>
+      <w:r>
+        <w:rPr>
+          <w:rFonts w:cstheme="minorHAnsi"/>
+        </w:rPr>
+        <w:t xml:space="preserve">) and </w:t>
+      </w:r>
+      <w:r>
+        <w:rPr>
+          <w:rFonts w:cstheme="minorHAnsi"/>
+          <w:lang w:val="en-US"/>
+        </w:rPr>
+        <w:t>have</w:t>
+      </w:r>
+      <w:r>
+        <w:rPr>
+          <w:rFonts w:cstheme="minorHAnsi"/>
+        </w:rPr>
+        <w:t xml:space="preserve"> be</w:t>
+      </w:r>
+      <w:r>
+        <w:rPr>
+          <w:rFonts w:cstheme="minorHAnsi"/>
+          <w:lang w:val="en-US"/>
+        </w:rPr>
+        <w:t>en</w:t>
+      </w:r>
+      <w:r>
+        <w:rPr>
+          <w:rFonts w:cstheme="minorHAnsi"/>
+        </w:rPr>
+        <w:t xml:space="preserve"> deposited on </w:t>
+      </w:r>
+      <w:r>
+        <w:rPr>
+          <w:rFonts w:cstheme="minorHAnsi"/>
+          <w:lang w:val="en-US"/>
+        </w:rPr>
+        <w:t>Ze</w:t>
+      </w:r>
+      <w:r>
+        <w:rPr>
+          <w:rFonts w:cstheme="minorHAnsi"/>
+          <w:lang w:val="en-US"/>
+        </w:rPr>
+        <w:t>nodo (</w:t>
+      </w:r>
+      <w:hyperlink r:id="rId9" w:history="1">
         <w:r>
           <w:rPr>
+            <w:rStyle w:val="Hyperlink"/>
             <w:rFonts w:cstheme="minorHAnsi"/>
-            <w:lang w:val="en-US"/>
           </w:rPr>
-          <w:delText xml:space="preserve"> (</w:delText>
-        </w:r>
-        <w:r>
-          <w:rPr>
-            <w:rFonts w:cstheme="minorHAnsi"/>
-            <w:lang w:val="en-US"/>
-          </w:rPr>
-          <w:fldChar w:fldCharType="begin"/>
-        </w:r>
-        <w:r>
-          <w:rPr>
-            <w:rFonts w:cstheme="minorHAnsi"/>
-            <w:lang w:val="en-US"/>
-          </w:rPr>
-          <w:delInstrText xml:space="preserve"> HYPERLINK "</w:delInstrText>
-        </w:r>
-        <w:r>
-          <w:rPr>
-            <w:rFonts w:cstheme="minorHAnsi"/>
-            <w:lang w:val="en-US"/>
-          </w:rPr>
-          <w:delInstrText>https://doi.org/10.5281/zenodo.6821804</w:delInstrText>
-        </w:r>
-        <w:r>
-          <w:rPr>
-            <w:rFonts w:cstheme="minorHAnsi"/>
-            <w:lang w:val="en-US"/>
-          </w:rPr>
-          <w:delInstrText xml:space="preserve">" </w:delInstrText>
-        </w:r>
-        <w:r>
-          <w:rPr>
-            <w:rFonts w:cstheme="minorHAnsi"/>
-            <w:lang w:val="en-US"/>
-          </w:rPr>
-          <w:fldChar w:fldCharType="separate"/>
+          <w:t>https://doi.org/10.</w:t>
         </w:r>
         <w:r>
           <w:rPr>
             <w:rStyle w:val="Hyperlink"/>
             <w:rFonts w:cstheme="minorHAnsi"/>
-            <w:lang w:val="en-US"/>
           </w:rPr>
-          <w:delText>https://doi.org/10.5281/zeno</w:delText>
+          <w:t>5</w:t>
         </w:r>
         <w:r>
           <w:rPr>
             <w:rStyle w:val="Hyperlink"/>
             <w:rFonts w:cstheme="minorHAnsi"/>
-            <w:lang w:val="en-US"/>
           </w:rPr>
-          <w:delText>d</w:delText>
+          <w:t>281/z</w:t>
         </w:r>
         <w:r>
           <w:rPr>
             <w:rStyle w:val="Hyperlink"/>
             <w:rFonts w:cstheme="minorHAnsi"/>
-            <w:lang w:val="en-US"/>
           </w:rPr>
-          <w:delText>o.68</w:delText>
+          <w:t>e</w:t>
         </w:r>
         <w:r>
           <w:rPr>
             <w:rStyle w:val="Hyperlink"/>
             <w:rFonts w:cstheme="minorHAnsi"/>
-            <w:lang w:val="en-US"/>
           </w:rPr>
-          <w:delText>21926</w:delText>
+          <w:t>nodo.</w:t>
         </w:r>
         <w:r>
           <w:rPr>
+            <w:rStyle w:val="Hyperlink"/>
             <w:rFonts w:cstheme="minorHAnsi"/>
-            <w:lang w:val="en-US"/>
           </w:rPr>
-          <w:fldChar w:fldCharType="end"/>
+          <w:t>6</w:t>
         </w:r>
         <w:r>
           <w:rPr>
+            <w:rStyle w:val="Hyperlink"/>
             <w:rFonts w:cstheme="minorHAnsi"/>
-            <w:lang w:val="en-US"/>
           </w:rPr>
-          <w:delText>)</w:delText>
+          <w:t>8</w:t>
         </w:r>
         <w:r>
           <w:rPr>
+            <w:rStyle w:val="Hyperlink"/>
             <w:rFonts w:cstheme="minorHAnsi"/>
           </w:rPr>
-          <w:delText>.</w:delText>
+          <w:t>2</w:t>
         </w:r>
-      </w:del>
+        <w:r>
+          <w:rPr>
+            <w:rStyle w:val="Hyperlink"/>
+            <w:rFonts w:cstheme="minorHAnsi"/>
+          </w:rPr>
+          <w:t>1926</w:t>
+        </w:r>
+      </w:hyperlink>
+      <w:r>
+        <w:rPr>
+          <w:rFonts w:cstheme="minorHAnsi"/>
+        </w:rPr>
+        <w:t>).</w:t>
+      </w:r>
     </w:p>
     <w:p>
       <w:pPr>
@@ -27898,48 +27823,9 @@
         <w:contextualSpacing/>
         <w:jc w:val="both"/>
         <w:rPr>
-          <w:ins w:id="2" w:author="Max Lindmark" w:date="2022-07-12T14:47:00Z"/>
-          <w:rFonts w:cstheme="minorHAnsi"/>
-          <w:lang w:val="en-US"/>
-          <w:rPrChange w:id="3" w:author="Max Lindmark" w:date="2022-07-12T14:48:00Z">
-            <w:rPr>
-              <w:ins w:id="4" w:author="Max Lindmark" w:date="2022-07-12T14:47:00Z"/>
-              <w:rFonts w:cstheme="minorHAnsi"/>
-            </w:rPr>
-          </w:rPrChange>
-        </w:rPr>
-      </w:pPr>
-      <w:proofErr w:type="spellStart"/>
-      <w:ins w:id="5" w:author="Max Lindmark" w:date="2022-07-12T14:48:00Z">
-        <w:r>
-          <w:rPr>
-            <w:rFonts w:cstheme="minorHAnsi"/>
-            <w:lang w:val="en-US"/>
-            <w:rPrChange w:id="6" w:author="Max Lindmark" w:date="2022-07-12T14:48:00Z">
-              <w:rPr>
-                <w:rFonts w:cstheme="minorHAnsi"/>
-                <w:lang w:val="sv-SE"/>
-              </w:rPr>
-            </w:rPrChange>
-          </w:rPr>
-          <w:t>Ze</w:t>
-        </w:r>
-        <w:r>
-          <w:rPr>
-            <w:rFonts w:cstheme="minorHAnsi"/>
-            <w:lang w:val="en-US"/>
-          </w:rPr>
-          <w:t>nodo</w:t>
-        </w:r>
-        <w:proofErr w:type="spellEnd"/>
-        <w:r>
-          <w:rPr>
-            <w:rFonts w:cstheme="minorHAnsi"/>
-            <w:lang w:val="en-US"/>
-          </w:rPr>
-          <w:t xml:space="preserve"> ()</w:t>
-        </w:r>
-      </w:ins>
+          <w:rFonts w:cstheme="minorHAnsi"/>
+        </w:rPr>
+      </w:pPr>
     </w:p>
     <w:p>
       <w:pPr>
@@ -27948,33 +27834,25 @@
         <w:jc w:val="both"/>
         <w:rPr>
           <w:rFonts w:cstheme="minorHAnsi"/>
-          <w:lang w:val="en-US"/>
-        </w:rPr>
-      </w:pPr>
+          <w:b/>
+        </w:rPr>
+      </w:pPr>
+      <w:r>
+        <w:rPr>
+          <w:rFonts w:cstheme="minorHAnsi"/>
+          <w:b/>
+        </w:rPr>
+        <w:t>References</w:t>
+      </w:r>
     </w:p>
     <w:p>
       <w:pPr>
-        <w:spacing w:line="480" w:lineRule="auto"/>
-        <w:contextualSpacing/>
-        <w:jc w:val="both"/>
-        <w:rPr>
-          <w:rFonts w:cstheme="minorHAnsi"/>
-          <w:b/>
-        </w:rPr>
-      </w:pPr>
-      <w:r>
-        <w:rPr>
-          <w:rFonts w:cstheme="minorHAnsi"/>
-          <w:b/>
-        </w:rPr>
-        <w:t>References</w:t>
-      </w:r>
-    </w:p>
-    <w:p>
-      <w:pPr>
         <w:pStyle w:val="Bibliography"/>
       </w:pPr>
       <w:r>
+        <w:rPr>
+          <w:lang w:val="en-SE"/>
+        </w:rPr>
         <w:t xml:space="preserve"> </w:t>
       </w:r>
       <w:r>
@@ -30235,7 +30113,7 @@
                     <pic:cNvPicPr/>
                   </pic:nvPicPr>
                   <pic:blipFill rotWithShape="1">
-                    <a:blip r:embed="rId8" cstate="print">
+                    <a:blip r:embed="rId10" cstate="print">
                       <a:extLst>
                         <a:ext uri="{28A0092B-C50C-407E-A947-70E740481C1C}">
                           <a14:useLocalDpi xmlns:a14="http://schemas.microsoft.com/office/drawing/2010/main" val="0"/>
@@ -30534,7 +30412,7 @@
                     <pic:cNvPicPr/>
                   </pic:nvPicPr>
                   <pic:blipFill rotWithShape="1">
-                    <a:blip r:embed="rId9" cstate="print">
+                    <a:blip r:embed="rId11" cstate="print">
                       <a:extLst>
                         <a:ext uri="{28A0092B-C50C-407E-A947-70E740481C1C}">
                           <a14:useLocalDpi xmlns:a14="http://schemas.microsoft.com/office/drawing/2010/main" val="0"/>
@@ -30748,7 +30626,7 @@
                     <pic:cNvPicPr/>
                   </pic:nvPicPr>
                   <pic:blipFill rotWithShape="1">
-                    <a:blip r:embed="rId10" cstate="print">
+                    <a:blip r:embed="rId12" cstate="print">
                       <a:extLst>
                         <a:ext uri="{28A0092B-C50C-407E-A947-70E740481C1C}">
                           <a14:useLocalDpi xmlns:a14="http://schemas.microsoft.com/office/drawing/2010/main" val="0"/>
@@ -30916,7 +30794,7 @@
                     <pic:cNvPicPr/>
                   </pic:nvPicPr>
                   <pic:blipFill rotWithShape="1">
-                    <a:blip r:embed="rId11" cstate="print">
+                    <a:blip r:embed="rId13" cstate="print">
                       <a:extLst>
                         <a:ext uri="{28A0092B-C50C-407E-A947-70E740481C1C}">
                           <a14:useLocalDpi xmlns:a14="http://schemas.microsoft.com/office/drawing/2010/main" val="0"/>
@@ -31145,7 +31023,7 @@
                     <pic:cNvPicPr/>
                   </pic:nvPicPr>
                   <pic:blipFill rotWithShape="1">
-                    <a:blip r:embed="rId12" cstate="print">
+                    <a:blip r:embed="rId14" cstate="print">
                       <a:extLst>
                         <a:ext uri="{28A0092B-C50C-407E-A947-70E740481C1C}">
                           <a14:useLocalDpi xmlns:a14="http://schemas.microsoft.com/office/drawing/2010/main" val="0"/>
@@ -31478,7 +31356,7 @@
                     <pic:cNvPicPr/>
                   </pic:nvPicPr>
                   <pic:blipFill rotWithShape="1">
-                    <a:blip r:embed="rId13" cstate="print">
+                    <a:blip r:embed="rId15" cstate="print">
                       <a:extLst>
                         <a:ext uri="{28A0092B-C50C-407E-A947-70E740481C1C}">
                           <a14:useLocalDpi xmlns:a14="http://schemas.microsoft.com/office/drawing/2010/main" val="0"/>
@@ -32140,10 +32018,10 @@
       </w:r>
     </w:p>
     <w:sectPr>
-      <w:headerReference w:type="even" r:id="rId14"/>
-      <w:footerReference w:type="even" r:id="rId15"/>
-      <w:footerReference w:type="default" r:id="rId16"/>
-      <w:headerReference w:type="first" r:id="rId17"/>
+      <w:headerReference w:type="even" r:id="rId16"/>
+      <w:footerReference w:type="even" r:id="rId17"/>
+      <w:footerReference w:type="default" r:id="rId18"/>
+      <w:headerReference w:type="first" r:id="rId19"/>
       <w:pgSz w:w="11906" w:h="16838" w:code="9"/>
       <w:pgMar w:top="1440" w:right="1440" w:bottom="1440" w:left="1440" w:header="851" w:footer="369" w:gutter="0"/>
       <w:lnNumType w:countBy="1" w:restart="continuous"/>

</xml_diff>

<commit_message>
final touches to readme and paper link to github
</commit_message>
<xml_diff>
--- a/baltic/drafts/GCB/accepted/MS-warming-size-spectrum-model.docx
+++ b/baltic/drafts/GCB/accepted/MS-warming-size-spectrum-model.docx
@@ -67,7 +67,15 @@
           <w:rFonts w:ascii="Times" w:hAnsi="Times" w:cstheme="minorHAnsi"/>
           <w:lang w:val="sv-SE"/>
         </w:rPr>
-        <w:t>, Asta Audzijonyte</w:t>
+        <w:t xml:space="preserve">, Asta </w:t>
+      </w:r>
+      <w:proofErr w:type="spellStart"/>
+      <w:r>
+        <w:rPr>
+          <w:rFonts w:ascii="Times" w:hAnsi="Times" w:cstheme="minorHAnsi"/>
+          <w:lang w:val="sv-SE"/>
+        </w:rPr>
+        <w:t>Audzijonyte</w:t>
       </w:r>
       <w:r>
         <w:rPr>
@@ -77,12 +85,21 @@
         </w:rPr>
         <w:t>b</w:t>
       </w:r>
+      <w:proofErr w:type="spellEnd"/>
       <w:r>
         <w:rPr>
           <w:rFonts w:ascii="Times" w:hAnsi="Times" w:cstheme="minorHAnsi"/>
           <w:lang w:val="sv-SE"/>
         </w:rPr>
-        <w:t>, Julia Blanchard</w:t>
+        <w:t xml:space="preserve">, Julia </w:t>
+      </w:r>
+      <w:proofErr w:type="spellStart"/>
+      <w:r>
+        <w:rPr>
+          <w:rFonts w:ascii="Times" w:hAnsi="Times" w:cstheme="minorHAnsi"/>
+          <w:lang w:val="sv-SE"/>
+        </w:rPr>
+        <w:t>Blanchard</w:t>
       </w:r>
       <w:r>
         <w:rPr>
@@ -92,12 +109,21 @@
         </w:rPr>
         <w:t>c</w:t>
       </w:r>
+      <w:proofErr w:type="spellEnd"/>
       <w:r>
         <w:rPr>
           <w:rFonts w:ascii="Times" w:hAnsi="Times" w:cstheme="minorHAnsi"/>
           <w:lang w:val="sv-SE"/>
         </w:rPr>
-        <w:t>, Anna Gårdmark</w:t>
+        <w:t xml:space="preserve">, Anna </w:t>
+      </w:r>
+      <w:proofErr w:type="spellStart"/>
+      <w:r>
+        <w:rPr>
+          <w:rFonts w:ascii="Times" w:hAnsi="Times" w:cstheme="minorHAnsi"/>
+          <w:lang w:val="sv-SE"/>
+        </w:rPr>
+        <w:t>Gårdmark</w:t>
       </w:r>
       <w:r>
         <w:rPr>
@@ -107,6 +133,7 @@
         </w:rPr>
         <w:t>d</w:t>
       </w:r>
+      <w:proofErr w:type="spellEnd"/>
     </w:p>
     <w:p>
       <w:pPr>
@@ -16248,6 +16275,7 @@
         <w:lastRenderedPageBreak/>
         <w:t>Activation energies are estimated with uncertainty a</w:t>
       </w:r>
+      <w:proofErr w:type="spellStart"/>
       <w:r>
         <w:rPr>
           <w:color w:val="000000"/>
@@ -16255,6 +16283,7 @@
         </w:rPr>
         <w:t>nd</w:t>
       </w:r>
+      <w:proofErr w:type="spellEnd"/>
       <w:r>
         <w:rPr>
           <w:color w:val="000000"/>
@@ -20547,13 +20576,23 @@
         </w:rPr>
         <w:t>. Temperature-dependen</w:t>
       </w:r>
+      <w:proofErr w:type="spellStart"/>
       <w:r>
         <w:rPr>
           <w:rFonts w:cstheme="minorHAnsi"/>
           <w:bCs/>
           <w:lang w:val="en-US"/>
         </w:rPr>
-        <w:t>ce of</w:t>
+        <w:t>ce</w:t>
+      </w:r>
+      <w:proofErr w:type="spellEnd"/>
+      <w:r>
+        <w:rPr>
+          <w:rFonts w:cstheme="minorHAnsi"/>
+          <w:bCs/>
+          <w:lang w:val="en-US"/>
+        </w:rPr>
+        <w:t xml:space="preserve"> of</w:t>
       </w:r>
       <w:r>
         <w:rPr>
@@ -21532,6 +21571,7 @@
         </w:rPr>
         <w:t>hanges in the size-structure var</w:t>
       </w:r>
+      <w:proofErr w:type="spellStart"/>
       <w:r>
         <w:rPr>
           <w:rFonts w:cstheme="minorHAnsi"/>
@@ -21540,6 +21580,7 @@
         </w:rPr>
         <w:t>ied</w:t>
       </w:r>
+      <w:proofErr w:type="spellEnd"/>
       <w:r>
         <w:rPr>
           <w:rFonts w:cstheme="minorHAnsi"/>
@@ -27690,62 +27731,114 @@
         </w:rPr>
         <w:t>All model code (parameterization, calibration and analysis) and data are available on GitHub (</w:t>
       </w:r>
+      <w:r>
+        <w:rPr>
+          <w:rFonts w:cstheme="minorHAnsi"/>
+        </w:rPr>
+        <w:fldChar w:fldCharType="begin"/>
+      </w:r>
+      <w:r>
+        <w:rPr>
+          <w:rFonts w:cstheme="minorHAnsi"/>
+        </w:rPr>
+        <w:instrText>HYPERLINK "https://github.com/maxlindmark/mizer-rewiring/tree/rewire-temp"</w:instrText>
+      </w:r>
+      <w:r>
+        <w:rPr>
+          <w:rFonts w:cstheme="minorHAnsi"/>
+        </w:rPr>
+      </w:r>
+      <w:r>
+        <w:rPr>
+          <w:rFonts w:cstheme="minorHAnsi"/>
+        </w:rPr>
+        <w:fldChar w:fldCharType="separate"/>
+      </w:r>
+      <w:r>
+        <w:rPr>
+          <w:rStyle w:val="Hyperlink"/>
+          <w:rFonts w:cstheme="minorHAnsi"/>
+        </w:rPr>
+        <w:t>https://github.com/maxlindmark/mizer-rewiring/tree/re</w:t>
+      </w:r>
+      <w:r>
+        <w:rPr>
+          <w:rStyle w:val="Hyperlink"/>
+          <w:rFonts w:cstheme="minorHAnsi"/>
+        </w:rPr>
+        <w:t>w</w:t>
+      </w:r>
+      <w:r>
+        <w:rPr>
+          <w:rStyle w:val="Hyperlink"/>
+          <w:rFonts w:cstheme="minorHAnsi"/>
+        </w:rPr>
+        <w:t>ire-temp</w:t>
+      </w:r>
+      <w:r>
+        <w:rPr>
+          <w:rFonts w:cstheme="minorHAnsi"/>
+        </w:rPr>
+        <w:fldChar w:fldCharType="end"/>
+      </w:r>
+      <w:r>
+        <w:rPr>
+          <w:rFonts w:cstheme="minorHAnsi"/>
+        </w:rPr>
+        <w:t xml:space="preserve">) and </w:t>
+      </w:r>
+      <w:r>
+        <w:rPr>
+          <w:rFonts w:cstheme="minorHAnsi"/>
+          <w:lang w:val="en-US"/>
+        </w:rPr>
+        <w:t>have</w:t>
+      </w:r>
+      <w:r>
+        <w:rPr>
+          <w:rFonts w:cstheme="minorHAnsi"/>
+        </w:rPr>
+        <w:t xml:space="preserve"> be</w:t>
+      </w:r>
+      <w:proofErr w:type="spellStart"/>
+      <w:r>
+        <w:rPr>
+          <w:rFonts w:cstheme="minorHAnsi"/>
+          <w:lang w:val="en-US"/>
+        </w:rPr>
+        <w:t>en</w:t>
+      </w:r>
+      <w:proofErr w:type="spellEnd"/>
+      <w:r>
+        <w:rPr>
+          <w:rFonts w:cstheme="minorHAnsi"/>
+        </w:rPr>
+        <w:t xml:space="preserve"> deposited on </w:t>
+      </w:r>
+      <w:proofErr w:type="spellStart"/>
+      <w:r>
+        <w:rPr>
+          <w:rFonts w:cstheme="minorHAnsi"/>
+          <w:lang w:val="en-US"/>
+        </w:rPr>
+        <w:t>Ze</w:t>
+      </w:r>
+      <w:r>
+        <w:rPr>
+          <w:rFonts w:cstheme="minorHAnsi"/>
+          <w:lang w:val="en-US"/>
+        </w:rPr>
+        <w:t>nodo</w:t>
+      </w:r>
+      <w:proofErr w:type="spellEnd"/>
+      <w:r>
+        <w:rPr>
+          <w:rFonts w:cstheme="minorHAnsi"/>
+          <w:lang w:val="en-US"/>
+        </w:rPr>
+        <w:t xml:space="preserve"> (</w:t>
+      </w:r>
       <w:hyperlink r:id="rId8" w:history="1">
-        <w:r>
-          <w:rPr>
-            <w:rStyle w:val="Hyperlink"/>
-            <w:rFonts w:cstheme="minorHAnsi"/>
-          </w:rPr>
-          <w:t>https://github.com/maxlindmark/mizer-rewiring/tree/rewire-temp/baltic</w:t>
-        </w:r>
-      </w:hyperlink>
-      <w:r>
-        <w:rPr>
-          <w:rFonts w:cstheme="minorHAnsi"/>
-        </w:rPr>
-        <w:t xml:space="preserve">) and </w:t>
-      </w:r>
-      <w:r>
-        <w:rPr>
-          <w:rFonts w:cstheme="minorHAnsi"/>
-          <w:lang w:val="en-US"/>
-        </w:rPr>
-        <w:t>have</w:t>
-      </w:r>
-      <w:r>
-        <w:rPr>
-          <w:rFonts w:cstheme="minorHAnsi"/>
-        </w:rPr>
-        <w:t xml:space="preserve"> be</w:t>
-      </w:r>
-      <w:r>
-        <w:rPr>
-          <w:rFonts w:cstheme="minorHAnsi"/>
-          <w:lang w:val="en-US"/>
-        </w:rPr>
-        <w:t>en</w:t>
-      </w:r>
-      <w:r>
-        <w:rPr>
-          <w:rFonts w:cstheme="minorHAnsi"/>
-        </w:rPr>
-        <w:t xml:space="preserve"> deposited on </w:t>
-      </w:r>
-      <w:r>
-        <w:rPr>
-          <w:rFonts w:cstheme="minorHAnsi"/>
-          <w:lang w:val="en-US"/>
-        </w:rPr>
-        <w:t>Ze</w:t>
-      </w:r>
-      <w:r>
-        <w:rPr>
-          <w:rFonts w:cstheme="minorHAnsi"/>
-          <w:lang w:val="en-US"/>
-        </w:rPr>
-        <w:t>nodo (</w:t>
-      </w:r>
-      <w:hyperlink r:id="rId9" w:history="1">
         <w:r>
           <w:rPr>
             <w:rStyle w:val="Hyperlink"/>
@@ -30113,7 +30206,7 @@
                     <pic:cNvPicPr/>
                   </pic:nvPicPr>
                   <pic:blipFill rotWithShape="1">
-                    <a:blip r:embed="rId10" cstate="print">
+                    <a:blip r:embed="rId9" cstate="print">
                       <a:extLst>
                         <a:ext uri="{28A0092B-C50C-407E-A947-70E740481C1C}">
                           <a14:useLocalDpi xmlns:a14="http://schemas.microsoft.com/office/drawing/2010/main" val="0"/>
@@ -30412,7 +30505,7 @@
                     <pic:cNvPicPr/>
                   </pic:nvPicPr>
                   <pic:blipFill rotWithShape="1">
-                    <a:blip r:embed="rId11" cstate="print">
+                    <a:blip r:embed="rId10" cstate="print">
                       <a:extLst>
                         <a:ext uri="{28A0092B-C50C-407E-A947-70E740481C1C}">
                           <a14:useLocalDpi xmlns:a14="http://schemas.microsoft.com/office/drawing/2010/main" val="0"/>
@@ -30626,7 +30719,7 @@
                     <pic:cNvPicPr/>
                   </pic:nvPicPr>
                   <pic:blipFill rotWithShape="1">
-                    <a:blip r:embed="rId12" cstate="print">
+                    <a:blip r:embed="rId11" cstate="print">
                       <a:extLst>
                         <a:ext uri="{28A0092B-C50C-407E-A947-70E740481C1C}">
                           <a14:useLocalDpi xmlns:a14="http://schemas.microsoft.com/office/drawing/2010/main" val="0"/>
@@ -30794,7 +30887,7 @@
                     <pic:cNvPicPr/>
                   </pic:nvPicPr>
                   <pic:blipFill rotWithShape="1">
-                    <a:blip r:embed="rId13" cstate="print">
+                    <a:blip r:embed="rId12" cstate="print">
                       <a:extLst>
                         <a:ext uri="{28A0092B-C50C-407E-A947-70E740481C1C}">
                           <a14:useLocalDpi xmlns:a14="http://schemas.microsoft.com/office/drawing/2010/main" val="0"/>
@@ -31023,7 +31116,7 @@
                     <pic:cNvPicPr/>
                   </pic:nvPicPr>
                   <pic:blipFill rotWithShape="1">
-                    <a:blip r:embed="rId14" cstate="print">
+                    <a:blip r:embed="rId13" cstate="print">
                       <a:extLst>
                         <a:ext uri="{28A0092B-C50C-407E-A947-70E740481C1C}">
                           <a14:useLocalDpi xmlns:a14="http://schemas.microsoft.com/office/drawing/2010/main" val="0"/>
@@ -31356,7 +31449,7 @@
                     <pic:cNvPicPr/>
                   </pic:nvPicPr>
                   <pic:blipFill rotWithShape="1">
-                    <a:blip r:embed="rId15" cstate="print">
+                    <a:blip r:embed="rId14" cstate="print">
                       <a:extLst>
                         <a:ext uri="{28A0092B-C50C-407E-A947-70E740481C1C}">
                           <a14:useLocalDpi xmlns:a14="http://schemas.microsoft.com/office/drawing/2010/main" val="0"/>
@@ -32018,10 +32111,10 @@
       </w:r>
     </w:p>
     <w:sectPr>
-      <w:headerReference w:type="even" r:id="rId16"/>
-      <w:footerReference w:type="even" r:id="rId17"/>
-      <w:footerReference w:type="default" r:id="rId18"/>
-      <w:headerReference w:type="first" r:id="rId19"/>
+      <w:headerReference w:type="even" r:id="rId15"/>
+      <w:footerReference w:type="even" r:id="rId16"/>
+      <w:footerReference w:type="default" r:id="rId17"/>
+      <w:headerReference w:type="first" r:id="rId18"/>
       <w:pgSz w:w="11906" w:h="16838" w:code="9"/>
       <w:pgMar w:top="1440" w:right="1440" w:bottom="1440" w:left="1440" w:header="851" w:footer="369" w:gutter="0"/>
       <w:lnNumType w:countBy="1" w:restart="continuous"/>

</xml_diff>

<commit_message>
remove track changes from ms
</commit_message>
<xml_diff>
--- a/baltic/drafts/GCB/accepted/MS-warming-size-spectrum-model.docx
+++ b/baltic/drafts/GCB/accepted/MS-warming-size-spectrum-model.docx
@@ -27759,21 +27759,7 @@
           <w:rStyle w:val="Hyperlink"/>
           <w:rFonts w:cstheme="minorHAnsi"/>
         </w:rPr>
-        <w:t>https://github.com/maxlindmark/mizer-rewiring/tree/re</w:t>
-      </w:r>
-      <w:r>
-        <w:rPr>
-          <w:rStyle w:val="Hyperlink"/>
-          <w:rFonts w:cstheme="minorHAnsi"/>
-        </w:rPr>
-        <w:t>w</w:t>
-      </w:r>
-      <w:r>
-        <w:rPr>
-          <w:rStyle w:val="Hyperlink"/>
-          <w:rFonts w:cstheme="minorHAnsi"/>
-        </w:rPr>
-        <w:t>ire-temp</w:t>
+        <w:t>https://github.com/maxlindmark/mizer-rewiring/tree/rewire-temp</w:t>
       </w:r>
       <w:r>
         <w:rPr>
@@ -27844,63 +27830,7 @@
             <w:rStyle w:val="Hyperlink"/>
             <w:rFonts w:cstheme="minorHAnsi"/>
           </w:rPr>
-          <w:t>https://doi.org/10.</w:t>
-        </w:r>
-        <w:r>
-          <w:rPr>
-            <w:rStyle w:val="Hyperlink"/>
-            <w:rFonts w:cstheme="minorHAnsi"/>
-          </w:rPr>
-          <w:t>5</w:t>
-        </w:r>
-        <w:r>
-          <w:rPr>
-            <w:rStyle w:val="Hyperlink"/>
-            <w:rFonts w:cstheme="minorHAnsi"/>
-          </w:rPr>
-          <w:t>281/z</w:t>
-        </w:r>
-        <w:r>
-          <w:rPr>
-            <w:rStyle w:val="Hyperlink"/>
-            <w:rFonts w:cstheme="minorHAnsi"/>
-          </w:rPr>
-          <w:t>e</w:t>
-        </w:r>
-        <w:r>
-          <w:rPr>
-            <w:rStyle w:val="Hyperlink"/>
-            <w:rFonts w:cstheme="minorHAnsi"/>
-          </w:rPr>
-          <w:t>nodo.</w:t>
-        </w:r>
-        <w:r>
-          <w:rPr>
-            <w:rStyle w:val="Hyperlink"/>
-            <w:rFonts w:cstheme="minorHAnsi"/>
-          </w:rPr>
-          <w:t>6</w:t>
-        </w:r>
-        <w:r>
-          <w:rPr>
-            <w:rStyle w:val="Hyperlink"/>
-            <w:rFonts w:cstheme="minorHAnsi"/>
-          </w:rPr>
-          <w:t>8</w:t>
-        </w:r>
-        <w:r>
-          <w:rPr>
-            <w:rStyle w:val="Hyperlink"/>
-            <w:rFonts w:cstheme="minorHAnsi"/>
-          </w:rPr>
-          <w:t>2</w:t>
-        </w:r>
-        <w:r>
-          <w:rPr>
-            <w:rStyle w:val="Hyperlink"/>
-            <w:rFonts w:cstheme="minorHAnsi"/>
-          </w:rPr>
-          <w:t>1926</w:t>
+          <w:t>https://doi.org/10.5281/zenodo.6821926</w:t>
         </w:r>
       </w:hyperlink>
       <w:r>

</xml_diff>